<commit_message>
Updated research detail to insights page from staging to live
</commit_message>
<xml_diff>
--- a/worksheet.docx
+++ b/worksheet.docx
@@ -86,6 +86,407 @@
       </w:r>
       <w:r>
         <w:t xml:space="preserve"> That's a strong and accurate answer in an interview.</w:t>
+      </w:r>
+    </w:p>
+    <w:p>
+      <w:pPr>
+        <w:pStyle w:val="text-size-chat"/>
+        <w:numPr>
+          <w:ilvl w:val="0"/>
+          <w:numId w:val="1"/>
+        </w:numPr>
+        <w:pBdr>
+          <w:top w:val="single" w:sz="2" w:space="0" w:color="auto"/>
+          <w:left w:val="single" w:sz="2" w:space="0" w:color="auto"/>
+          <w:bottom w:val="single" w:sz="2" w:space="0" w:color="auto"/>
+          <w:right w:val="single" w:sz="2" w:space="0" w:color="auto"/>
+        </w:pBdr>
+        <w:shd w:val="clear" w:color="auto" w:fill="FFFFFF"/>
+        <w:spacing w:before="0" w:beforeAutospacing="0" w:after="90" w:afterAutospacing="0"/>
+        <w:rPr>
+          <w:rFonts w:ascii="Segoe UI" w:hAnsi="Segoe UI" w:cs="Segoe UI"/>
+          <w:color w:val="0D0D0D"/>
+          <w:sz w:val="20"/>
+          <w:szCs w:val="20"/>
+        </w:rPr>
+      </w:pPr>
+      <w:r>
+        <w:t>------------------------------------------------------------------------</w:t>
+      </w:r>
+      <w:r>
+        <w:br/>
+      </w:r>
+      <w:r>
+        <w:rPr>
+          <w:rFonts w:ascii="Segoe UI" w:hAnsi="Segoe UI" w:cs="Segoe UI"/>
+          <w:color w:val="0D0D0D"/>
+          <w:sz w:val="20"/>
+          <w:szCs w:val="20"/>
+        </w:rPr>
+        <w:t>use the simplest tool that solves the problem well</w:t>
+      </w:r>
+    </w:p>
+    <w:p>
+      <w:pPr>
+        <w:pStyle w:val="text-size-chat"/>
+        <w:numPr>
+          <w:ilvl w:val="0"/>
+          <w:numId w:val="1"/>
+        </w:numPr>
+        <w:pBdr>
+          <w:top w:val="single" w:sz="2" w:space="0" w:color="auto"/>
+          <w:left w:val="single" w:sz="2" w:space="0" w:color="auto"/>
+          <w:bottom w:val="single" w:sz="2" w:space="0" w:color="auto"/>
+          <w:right w:val="single" w:sz="2" w:space="0" w:color="auto"/>
+        </w:pBdr>
+        <w:shd w:val="clear" w:color="auto" w:fill="FFFFFF"/>
+        <w:spacing w:before="0" w:beforeAutospacing="0" w:after="90" w:afterAutospacing="0"/>
+        <w:rPr>
+          <w:rFonts w:ascii="Segoe UI" w:hAnsi="Segoe UI" w:cs="Segoe UI"/>
+          <w:color w:val="0D0D0D"/>
+          <w:sz w:val="20"/>
+          <w:szCs w:val="20"/>
+        </w:rPr>
+      </w:pPr>
+      <w:r>
+        <w:rPr>
+          <w:rFonts w:ascii="Segoe UI" w:hAnsi="Segoe UI" w:cs="Segoe UI"/>
+          <w:color w:val="0D0D0D"/>
+          <w:sz w:val="20"/>
+          <w:szCs w:val="20"/>
+        </w:rPr>
+        <w:t>some problems need rules, dashboards, or SQL, not AI</w:t>
+      </w:r>
+    </w:p>
+    <w:p>
+      <w:pPr>
+        <w:pStyle w:val="text-size-chat"/>
+        <w:numPr>
+          <w:ilvl w:val="0"/>
+          <w:numId w:val="1"/>
+        </w:numPr>
+        <w:pBdr>
+          <w:top w:val="single" w:sz="2" w:space="0" w:color="auto"/>
+          <w:left w:val="single" w:sz="2" w:space="0" w:color="auto"/>
+          <w:bottom w:val="single" w:sz="2" w:space="0" w:color="auto"/>
+          <w:right w:val="single" w:sz="2" w:space="0" w:color="auto"/>
+        </w:pBdr>
+        <w:shd w:val="clear" w:color="auto" w:fill="FFFFFF"/>
+        <w:spacing w:before="0" w:beforeAutospacing="0" w:after="90" w:afterAutospacing="0"/>
+        <w:rPr>
+          <w:rFonts w:ascii="Segoe UI" w:hAnsi="Segoe UI" w:cs="Segoe UI"/>
+          <w:color w:val="0D0D0D"/>
+          <w:sz w:val="20"/>
+          <w:szCs w:val="20"/>
+        </w:rPr>
+      </w:pPr>
+      <w:r>
+        <w:rPr>
+          <w:rFonts w:ascii="Segoe UI" w:hAnsi="Segoe UI" w:cs="Segoe UI"/>
+          <w:color w:val="0D0D0D"/>
+          <w:sz w:val="20"/>
+          <w:szCs w:val="20"/>
+        </w:rPr>
+        <w:t>some need ML</w:t>
+      </w:r>
+    </w:p>
+    <w:p>
+      <w:pPr>
+        <w:pStyle w:val="text-size-chat"/>
+        <w:numPr>
+          <w:ilvl w:val="0"/>
+          <w:numId w:val="1"/>
+        </w:numPr>
+        <w:pBdr>
+          <w:top w:val="single" w:sz="2" w:space="0" w:color="auto"/>
+          <w:left w:val="single" w:sz="2" w:space="0" w:color="auto"/>
+          <w:bottom w:val="single" w:sz="2" w:space="0" w:color="auto"/>
+          <w:right w:val="single" w:sz="2" w:space="0" w:color="auto"/>
+        </w:pBdr>
+        <w:shd w:val="clear" w:color="auto" w:fill="FFFFFF"/>
+        <w:spacing w:before="0" w:beforeAutospacing="0" w:after="90" w:afterAutospacing="0"/>
+        <w:rPr>
+          <w:rFonts w:ascii="Segoe UI" w:hAnsi="Segoe UI" w:cs="Segoe UI"/>
+          <w:color w:val="0D0D0D"/>
+          <w:sz w:val="20"/>
+          <w:szCs w:val="20"/>
+        </w:rPr>
+      </w:pPr>
+      <w:r>
+        <w:rPr>
+          <w:rFonts w:ascii="Segoe UI" w:hAnsi="Segoe UI" w:cs="Segoe UI"/>
+          <w:color w:val="0D0D0D"/>
+          <w:sz w:val="20"/>
+          <w:szCs w:val="20"/>
+        </w:rPr>
+        <w:t>some need GenAI</w:t>
+      </w:r>
+    </w:p>
+    <w:p>
+      <w:pPr>
+        <w:pStyle w:val="text-size-chat"/>
+        <w:numPr>
+          <w:ilvl w:val="0"/>
+          <w:numId w:val="1"/>
+        </w:numPr>
+        <w:pBdr>
+          <w:top w:val="single" w:sz="2" w:space="0" w:color="auto"/>
+          <w:left w:val="single" w:sz="2" w:space="0" w:color="auto"/>
+          <w:bottom w:val="single" w:sz="2" w:space="0" w:color="auto"/>
+          <w:right w:val="single" w:sz="2" w:space="0" w:color="auto"/>
+        </w:pBdr>
+        <w:shd w:val="clear" w:color="auto" w:fill="FFFFFF"/>
+        <w:spacing w:before="0" w:beforeAutospacing="0" w:after="90" w:afterAutospacing="0"/>
+        <w:rPr>
+          <w:rFonts w:ascii="Segoe UI" w:hAnsi="Segoe UI" w:cs="Segoe UI"/>
+          <w:color w:val="0D0D0D"/>
+          <w:sz w:val="20"/>
+          <w:szCs w:val="20"/>
+        </w:rPr>
+      </w:pPr>
+      <w:r>
+        <w:rPr>
+          <w:rFonts w:ascii="Segoe UI" w:hAnsi="Segoe UI" w:cs="Segoe UI"/>
+          <w:color w:val="0D0D0D"/>
+          <w:sz w:val="20"/>
+          <w:szCs w:val="20"/>
+        </w:rPr>
+        <w:t>very few need fully autonomous agents</w:t>
+      </w:r>
+    </w:p>
+    <w:p>
+      <w:pPr>
+        <w:pStyle w:val="text-size-chat"/>
+        <w:pBdr>
+          <w:top w:val="single" w:sz="2" w:space="0" w:color="auto"/>
+          <w:left w:val="single" w:sz="2" w:space="0" w:color="auto"/>
+          <w:bottom w:val="single" w:sz="2" w:space="0" w:color="auto"/>
+          <w:right w:val="single" w:sz="2" w:space="0" w:color="auto"/>
+        </w:pBdr>
+        <w:shd w:val="clear" w:color="auto" w:fill="FFFFFF"/>
+        <w:spacing w:before="0" w:beforeAutospacing="0" w:after="0" w:afterAutospacing="0"/>
+        <w:rPr>
+          <w:rFonts w:ascii="Segoe UI" w:hAnsi="Segoe UI" w:cs="Segoe UI"/>
+          <w:color w:val="0D0D0D"/>
+          <w:sz w:val="20"/>
+          <w:szCs w:val="20"/>
+        </w:rPr>
+      </w:pPr>
+      <w:r>
+        <w:rPr>
+          <w:rFonts w:ascii="Segoe UI" w:hAnsi="Segoe UI" w:cs="Segoe UI"/>
+          <w:color w:val="0D0D0D"/>
+          <w:sz w:val="20"/>
+          <w:szCs w:val="20"/>
+        </w:rPr>
+        <w:t xml:space="preserve">For your world, WAIMS is </w:t>
+      </w:r>
+      <w:proofErr w:type="gramStart"/>
+      <w:r>
+        <w:rPr>
+          <w:rFonts w:ascii="Segoe UI" w:hAnsi="Segoe UI" w:cs="Segoe UI"/>
+          <w:color w:val="0D0D0D"/>
+          <w:sz w:val="20"/>
+          <w:szCs w:val="20"/>
+        </w:rPr>
+        <w:t>actually a</w:t>
+      </w:r>
+      <w:proofErr w:type="gramEnd"/>
+      <w:r>
+        <w:rPr>
+          <w:rFonts w:ascii="Segoe UI" w:hAnsi="Segoe UI" w:cs="Segoe UI"/>
+          <w:color w:val="0D0D0D"/>
+          <w:sz w:val="20"/>
+          <w:szCs w:val="20"/>
+        </w:rPr>
+        <w:t xml:space="preserve"> good example:</w:t>
+      </w:r>
+    </w:p>
+    <w:p>
+      <w:pPr>
+        <w:pStyle w:val="text-size-chat"/>
+        <w:numPr>
+          <w:ilvl w:val="0"/>
+          <w:numId w:val="2"/>
+        </w:numPr>
+        <w:pBdr>
+          <w:top w:val="single" w:sz="2" w:space="0" w:color="auto"/>
+          <w:left w:val="single" w:sz="2" w:space="0" w:color="auto"/>
+          <w:bottom w:val="single" w:sz="2" w:space="0" w:color="auto"/>
+          <w:right w:val="single" w:sz="2" w:space="0" w:color="auto"/>
+        </w:pBdr>
+        <w:shd w:val="clear" w:color="auto" w:fill="FFFFFF"/>
+        <w:spacing w:before="0" w:beforeAutospacing="0" w:after="90" w:afterAutospacing="0"/>
+        <w:rPr>
+          <w:rFonts w:ascii="Segoe UI" w:hAnsi="Segoe UI" w:cs="Segoe UI"/>
+          <w:color w:val="0D0D0D"/>
+          <w:sz w:val="20"/>
+          <w:szCs w:val="20"/>
+        </w:rPr>
+      </w:pPr>
+      <w:r>
+        <w:rPr>
+          <w:rFonts w:ascii="Segoe UI" w:hAnsi="Segoe UI" w:cs="Segoe UI"/>
+          <w:color w:val="0D0D0D"/>
+          <w:sz w:val="20"/>
+          <w:szCs w:val="20"/>
+        </w:rPr>
+        <w:t>readiness scoring / forecasting: ML or rule-based models</w:t>
+      </w:r>
+    </w:p>
+    <w:p>
+      <w:pPr>
+        <w:pStyle w:val="text-size-chat"/>
+        <w:numPr>
+          <w:ilvl w:val="0"/>
+          <w:numId w:val="2"/>
+        </w:numPr>
+        <w:pBdr>
+          <w:top w:val="single" w:sz="2" w:space="0" w:color="auto"/>
+          <w:left w:val="single" w:sz="2" w:space="0" w:color="auto"/>
+          <w:bottom w:val="single" w:sz="2" w:space="0" w:color="auto"/>
+          <w:right w:val="single" w:sz="2" w:space="0" w:color="auto"/>
+        </w:pBdr>
+        <w:shd w:val="clear" w:color="auto" w:fill="FFFFFF"/>
+        <w:spacing w:before="0" w:beforeAutospacing="0" w:after="90" w:afterAutospacing="0"/>
+        <w:rPr>
+          <w:rFonts w:ascii="Segoe UI" w:hAnsi="Segoe UI" w:cs="Segoe UI"/>
+          <w:color w:val="0D0D0D"/>
+          <w:sz w:val="20"/>
+          <w:szCs w:val="20"/>
+        </w:rPr>
+      </w:pPr>
+      <w:r>
+        <w:rPr>
+          <w:rFonts w:ascii="Segoe UI" w:hAnsi="Segoe UI" w:cs="Segoe UI"/>
+          <w:color w:val="0D0D0D"/>
+          <w:sz w:val="20"/>
+          <w:szCs w:val="20"/>
+        </w:rPr>
+        <w:t>force plate / pattern detection: analytics + maybe ML</w:t>
+      </w:r>
+    </w:p>
+    <w:p>
+      <w:pPr>
+        <w:pStyle w:val="text-size-chat"/>
+        <w:numPr>
+          <w:ilvl w:val="0"/>
+          <w:numId w:val="2"/>
+        </w:numPr>
+        <w:pBdr>
+          <w:top w:val="single" w:sz="2" w:space="0" w:color="auto"/>
+          <w:left w:val="single" w:sz="2" w:space="0" w:color="auto"/>
+          <w:bottom w:val="single" w:sz="2" w:space="0" w:color="auto"/>
+          <w:right w:val="single" w:sz="2" w:space="0" w:color="auto"/>
+        </w:pBdr>
+        <w:shd w:val="clear" w:color="auto" w:fill="FFFFFF"/>
+        <w:spacing w:before="0" w:beforeAutospacing="0" w:after="90" w:afterAutospacing="0"/>
+        <w:rPr>
+          <w:rFonts w:ascii="Segoe UI" w:hAnsi="Segoe UI" w:cs="Segoe UI"/>
+          <w:color w:val="0D0D0D"/>
+          <w:sz w:val="20"/>
+          <w:szCs w:val="20"/>
+        </w:rPr>
+      </w:pPr>
+      <w:proofErr w:type="gramStart"/>
+      <w:r>
+        <w:rPr>
+          <w:rFonts w:ascii="Segoe UI" w:hAnsi="Segoe UI" w:cs="Segoe UI"/>
+          <w:color w:val="0D0D0D"/>
+          <w:sz w:val="20"/>
+          <w:szCs w:val="20"/>
+        </w:rPr>
+        <w:t>coach</w:t>
+      </w:r>
+      <w:proofErr w:type="gramEnd"/>
+      <w:r>
+        <w:rPr>
+          <w:rFonts w:ascii="Segoe UI" w:hAnsi="Segoe UI" w:cs="Segoe UI"/>
+          <w:color w:val="0D0D0D"/>
+          <w:sz w:val="20"/>
+          <w:szCs w:val="20"/>
+        </w:rPr>
+        <w:t xml:space="preserve"> and athlete voice Q&amp;A: GenAI or lighter NLP on top</w:t>
+      </w:r>
+    </w:p>
+    <w:p>
+      <w:pPr>
+        <w:pStyle w:val="text-size-chat"/>
+        <w:numPr>
+          <w:ilvl w:val="0"/>
+          <w:numId w:val="2"/>
+        </w:numPr>
+        <w:pBdr>
+          <w:top w:val="single" w:sz="2" w:space="0" w:color="auto"/>
+          <w:left w:val="single" w:sz="2" w:space="0" w:color="auto"/>
+          <w:bottom w:val="single" w:sz="2" w:space="0" w:color="auto"/>
+          <w:right w:val="single" w:sz="2" w:space="0" w:color="auto"/>
+        </w:pBdr>
+        <w:shd w:val="clear" w:color="auto" w:fill="FFFFFF"/>
+        <w:spacing w:before="0" w:beforeAutospacing="0" w:after="90" w:afterAutospacing="0"/>
+        <w:rPr>
+          <w:rFonts w:ascii="Segoe UI" w:hAnsi="Segoe UI" w:cs="Segoe UI"/>
+          <w:color w:val="0D0D0D"/>
+          <w:sz w:val="20"/>
+          <w:szCs w:val="20"/>
+        </w:rPr>
+      </w:pPr>
+      <w:r>
+        <w:rPr>
+          <w:rFonts w:ascii="Segoe UI" w:hAnsi="Segoe UI" w:cs="Segoe UI"/>
+          <w:color w:val="0D0D0D"/>
+          <w:sz w:val="20"/>
+          <w:szCs w:val="20"/>
+        </w:rPr>
+        <w:t>workflow automation across reports, alerts, exports: agents later</w:t>
+      </w:r>
+    </w:p>
+    <w:p>
+      <w:pPr>
+        <w:pStyle w:val="text-size-chat"/>
+        <w:pBdr>
+          <w:top w:val="single" w:sz="2" w:space="0" w:color="auto"/>
+          <w:left w:val="single" w:sz="2" w:space="0" w:color="auto"/>
+          <w:bottom w:val="single" w:sz="2" w:space="0" w:color="auto"/>
+          <w:right w:val="single" w:sz="2" w:space="0" w:color="auto"/>
+        </w:pBdr>
+        <w:shd w:val="clear" w:color="auto" w:fill="FFFFFF"/>
+        <w:spacing w:before="0" w:beforeAutospacing="0" w:after="0" w:afterAutospacing="0"/>
+        <w:rPr>
+          <w:rFonts w:ascii="Segoe UI" w:hAnsi="Segoe UI" w:cs="Segoe UI"/>
+          <w:color w:val="0D0D0D"/>
+          <w:sz w:val="20"/>
+          <w:szCs w:val="20"/>
+        </w:rPr>
+      </w:pPr>
+      <w:proofErr w:type="gramStart"/>
+      <w:r>
+        <w:rPr>
+          <w:rFonts w:ascii="Segoe UI" w:hAnsi="Segoe UI" w:cs="Segoe UI"/>
+          <w:color w:val="0D0D0D"/>
+          <w:sz w:val="20"/>
+          <w:szCs w:val="20"/>
+        </w:rPr>
+        <w:t>So</w:t>
+      </w:r>
+      <w:proofErr w:type="gramEnd"/>
+      <w:r>
+        <w:rPr>
+          <w:rFonts w:ascii="Segoe UI" w:hAnsi="Segoe UI" w:cs="Segoe UI"/>
+          <w:color w:val="0D0D0D"/>
+          <w:sz w:val="20"/>
+          <w:szCs w:val="20"/>
+        </w:rPr>
+        <w:t xml:space="preserve"> I’d say the post is directionally smart, but it risks overselling a rigid maturity ladder. </w:t>
+      </w:r>
+      <w:r>
+        <w:rPr>
+          <w:rFonts w:ascii="Segoe UI" w:hAnsi="Segoe UI" w:cs="Segoe UI"/>
+          <w:color w:val="EE0000"/>
+          <w:sz w:val="36"/>
+          <w:szCs w:val="36"/>
+        </w:rPr>
+        <w:t>The real answer is not “what layer are you on?” so much as “what decision are you trying to improve, and what is the lightest reliable method to do it?”</w:t>
       </w:r>
     </w:p>
     <w:p>
@@ -875,6 +1276,315 @@
     </w:sectPr>
   </w:body>
 </w:document>
+</file>
+
+<file path=word/numbering.xml><?xml version="1.0" encoding="utf-8"?>
+<w:numbering xmlns:wpc="http://schemas.microsoft.com/office/word/2010/wordprocessingCanvas" xmlns:cx="http://schemas.microsoft.com/office/drawing/2014/chartex" xmlns:cx1="http://schemas.microsoft.com/office/drawing/2015/9/8/chartex" xmlns:cx2="http://schemas.microsoft.com/office/drawing/2015/10/21/chartex" xmlns:cx3="http://schemas.microsoft.com/office/drawing/2016/5/9/chartex" xmlns:cx4="http://schemas.microsoft.com/office/drawing/2016/5/10/chartex" xmlns:cx5="http://schemas.microsoft.com/office/drawing/2016/5/11/chartex" xmlns:cx6="http://schemas.microsoft.com/office/drawing/2016/5/12/chartex" xmlns:cx7="http://schemas.microsoft.com/office/drawing/2016/5/13/chartex" xmlns:cx8="http://schemas.microsoft.com/office/drawing/2016/5/14/chartex" xmlns:mc="http://schemas.openxmlformats.org/markup-compatibility/2006" xmlns:aink="http://schemas.microsoft.com/office/drawing/2016/ink" xmlns:am3d="http://schemas.microsoft.com/office/drawing/2017/model3d" xmlns:o="urn:schemas-microsoft-com:office:office" xmlns:oel="http://schemas.microsoft.com/office/2019/extlst" xmlns:r="http://schemas.openxmlformats.org/officeDocument/2006/relationships" xmlns:m="http://schemas.openxmlformats.org/officeDocument/2006/math" xmlns:v="urn:schemas-microsoft-com:vml" xmlns:wp14="http://schemas.microsoft.com/office/word/2010/wordprocessingDrawing" xmlns:wp="http://schemas.openxmlformats.org/drawingml/2006/wordprocessingDrawing" xmlns:w10="urn:schemas-microsoft-com:office:word" xmlns:w="http://schemas.openxmlformats.org/wordprocessingml/2006/main" xmlns:w14="http://schemas.microsoft.com/office/word/2010/wordml" xmlns:w15="http://schemas.microsoft.com/office/word/2012/wordml" xmlns:w16cex="http://schemas.microsoft.com/office/word/2018/wordml/cex" xmlns:w16cid="http://schemas.microsoft.com/office/word/2016/wordml/cid" xmlns:w16="http://schemas.microsoft.com/office/word/2018/wordml" xmlns:w16du="http://schemas.microsoft.com/office/word/2023/wordml/word16du" xmlns:w16sdtdh="http://schemas.microsoft.com/office/word/2020/wordml/sdtdatahash" xmlns:w16sdtfl="http://schemas.microsoft.com/office/word/2024/wordml/sdtformatlock" xmlns:w16se="http://schemas.microsoft.com/office/word/2015/wordml/symex" xmlns:wpg="http://schemas.microsoft.com/office/word/2010/wordprocessingGroup" xmlns:wpi="http://schemas.microsoft.com/office/word/2010/wordprocessingInk" xmlns:wne="http://schemas.microsoft.com/office/word/2006/wordml" xmlns:wps="http://schemas.microsoft.com/office/word/2010/wordprocessingShape" mc:Ignorable="w14 w15 w16se w16cid w16 w16cex w16sdtdh w16sdtfl w16du wp14">
+  <w:abstractNum w:abstractNumId="0" w15:restartNumberingAfterBreak="0">
+    <w:nsid w:val="02B17A15"/>
+    <w:multiLevelType w:val="multilevel"/>
+    <w:tmpl w:val="8806BCE8"/>
+    <w:lvl w:ilvl="0">
+      <w:start w:val="1"/>
+      <w:numFmt w:val="bullet"/>
+      <w:lvlText w:val=""/>
+      <w:lvlJc w:val="left"/>
+      <w:pPr>
+        <w:tabs>
+          <w:tab w:val="num" w:pos="720"/>
+        </w:tabs>
+        <w:ind w:left="720" w:hanging="360"/>
+      </w:pPr>
+      <w:rPr>
+        <w:rFonts w:ascii="Symbol" w:hAnsi="Symbol" w:hint="default"/>
+        <w:sz w:val="20"/>
+      </w:rPr>
+    </w:lvl>
+    <w:lvl w:ilvl="1" w:tentative="1">
+      <w:start w:val="1"/>
+      <w:numFmt w:val="bullet"/>
+      <w:lvlText w:val=""/>
+      <w:lvlJc w:val="left"/>
+      <w:pPr>
+        <w:tabs>
+          <w:tab w:val="num" w:pos="1440"/>
+        </w:tabs>
+        <w:ind w:left="1440" w:hanging="360"/>
+      </w:pPr>
+      <w:rPr>
+        <w:rFonts w:ascii="Symbol" w:hAnsi="Symbol" w:hint="default"/>
+        <w:sz w:val="20"/>
+      </w:rPr>
+    </w:lvl>
+    <w:lvl w:ilvl="2" w:tentative="1">
+      <w:start w:val="1"/>
+      <w:numFmt w:val="bullet"/>
+      <w:lvlText w:val=""/>
+      <w:lvlJc w:val="left"/>
+      <w:pPr>
+        <w:tabs>
+          <w:tab w:val="num" w:pos="2160"/>
+        </w:tabs>
+        <w:ind w:left="2160" w:hanging="360"/>
+      </w:pPr>
+      <w:rPr>
+        <w:rFonts w:ascii="Symbol" w:hAnsi="Symbol" w:hint="default"/>
+        <w:sz w:val="20"/>
+      </w:rPr>
+    </w:lvl>
+    <w:lvl w:ilvl="3" w:tentative="1">
+      <w:start w:val="1"/>
+      <w:numFmt w:val="bullet"/>
+      <w:lvlText w:val=""/>
+      <w:lvlJc w:val="left"/>
+      <w:pPr>
+        <w:tabs>
+          <w:tab w:val="num" w:pos="2880"/>
+        </w:tabs>
+        <w:ind w:left="2880" w:hanging="360"/>
+      </w:pPr>
+      <w:rPr>
+        <w:rFonts w:ascii="Symbol" w:hAnsi="Symbol" w:hint="default"/>
+        <w:sz w:val="20"/>
+      </w:rPr>
+    </w:lvl>
+    <w:lvl w:ilvl="4" w:tentative="1">
+      <w:start w:val="1"/>
+      <w:numFmt w:val="bullet"/>
+      <w:lvlText w:val=""/>
+      <w:lvlJc w:val="left"/>
+      <w:pPr>
+        <w:tabs>
+          <w:tab w:val="num" w:pos="3600"/>
+        </w:tabs>
+        <w:ind w:left="3600" w:hanging="360"/>
+      </w:pPr>
+      <w:rPr>
+        <w:rFonts w:ascii="Symbol" w:hAnsi="Symbol" w:hint="default"/>
+        <w:sz w:val="20"/>
+      </w:rPr>
+    </w:lvl>
+    <w:lvl w:ilvl="5" w:tentative="1">
+      <w:start w:val="1"/>
+      <w:numFmt w:val="bullet"/>
+      <w:lvlText w:val=""/>
+      <w:lvlJc w:val="left"/>
+      <w:pPr>
+        <w:tabs>
+          <w:tab w:val="num" w:pos="4320"/>
+        </w:tabs>
+        <w:ind w:left="4320" w:hanging="360"/>
+      </w:pPr>
+      <w:rPr>
+        <w:rFonts w:ascii="Symbol" w:hAnsi="Symbol" w:hint="default"/>
+        <w:sz w:val="20"/>
+      </w:rPr>
+    </w:lvl>
+    <w:lvl w:ilvl="6" w:tentative="1">
+      <w:start w:val="1"/>
+      <w:numFmt w:val="bullet"/>
+      <w:lvlText w:val=""/>
+      <w:lvlJc w:val="left"/>
+      <w:pPr>
+        <w:tabs>
+          <w:tab w:val="num" w:pos="5040"/>
+        </w:tabs>
+        <w:ind w:left="5040" w:hanging="360"/>
+      </w:pPr>
+      <w:rPr>
+        <w:rFonts w:ascii="Symbol" w:hAnsi="Symbol" w:hint="default"/>
+        <w:sz w:val="20"/>
+      </w:rPr>
+    </w:lvl>
+    <w:lvl w:ilvl="7" w:tentative="1">
+      <w:start w:val="1"/>
+      <w:numFmt w:val="bullet"/>
+      <w:lvlText w:val=""/>
+      <w:lvlJc w:val="left"/>
+      <w:pPr>
+        <w:tabs>
+          <w:tab w:val="num" w:pos="5760"/>
+        </w:tabs>
+        <w:ind w:left="5760" w:hanging="360"/>
+      </w:pPr>
+      <w:rPr>
+        <w:rFonts w:ascii="Symbol" w:hAnsi="Symbol" w:hint="default"/>
+        <w:sz w:val="20"/>
+      </w:rPr>
+    </w:lvl>
+    <w:lvl w:ilvl="8" w:tentative="1">
+      <w:start w:val="1"/>
+      <w:numFmt w:val="bullet"/>
+      <w:lvlText w:val=""/>
+      <w:lvlJc w:val="left"/>
+      <w:pPr>
+        <w:tabs>
+          <w:tab w:val="num" w:pos="6480"/>
+        </w:tabs>
+        <w:ind w:left="6480" w:hanging="360"/>
+      </w:pPr>
+      <w:rPr>
+        <w:rFonts w:ascii="Symbol" w:hAnsi="Symbol" w:hint="default"/>
+        <w:sz w:val="20"/>
+      </w:rPr>
+    </w:lvl>
+  </w:abstractNum>
+  <w:abstractNum w:abstractNumId="1" w15:restartNumberingAfterBreak="0">
+    <w:nsid w:val="6C1001F2"/>
+    <w:multiLevelType w:val="multilevel"/>
+    <w:tmpl w:val="A4387C4E"/>
+    <w:lvl w:ilvl="0">
+      <w:start w:val="1"/>
+      <w:numFmt w:val="bullet"/>
+      <w:lvlText w:val=""/>
+      <w:lvlJc w:val="left"/>
+      <w:pPr>
+        <w:tabs>
+          <w:tab w:val="num" w:pos="720"/>
+        </w:tabs>
+        <w:ind w:left="720" w:hanging="360"/>
+      </w:pPr>
+      <w:rPr>
+        <w:rFonts w:ascii="Symbol" w:hAnsi="Symbol" w:hint="default"/>
+        <w:sz w:val="20"/>
+      </w:rPr>
+    </w:lvl>
+    <w:lvl w:ilvl="1" w:tentative="1">
+      <w:start w:val="1"/>
+      <w:numFmt w:val="bullet"/>
+      <w:lvlText w:val=""/>
+      <w:lvlJc w:val="left"/>
+      <w:pPr>
+        <w:tabs>
+          <w:tab w:val="num" w:pos="1440"/>
+        </w:tabs>
+        <w:ind w:left="1440" w:hanging="360"/>
+      </w:pPr>
+      <w:rPr>
+        <w:rFonts w:ascii="Symbol" w:hAnsi="Symbol" w:hint="default"/>
+        <w:sz w:val="20"/>
+      </w:rPr>
+    </w:lvl>
+    <w:lvl w:ilvl="2" w:tentative="1">
+      <w:start w:val="1"/>
+      <w:numFmt w:val="bullet"/>
+      <w:lvlText w:val=""/>
+      <w:lvlJc w:val="left"/>
+      <w:pPr>
+        <w:tabs>
+          <w:tab w:val="num" w:pos="2160"/>
+        </w:tabs>
+        <w:ind w:left="2160" w:hanging="360"/>
+      </w:pPr>
+      <w:rPr>
+        <w:rFonts w:ascii="Symbol" w:hAnsi="Symbol" w:hint="default"/>
+        <w:sz w:val="20"/>
+      </w:rPr>
+    </w:lvl>
+    <w:lvl w:ilvl="3" w:tentative="1">
+      <w:start w:val="1"/>
+      <w:numFmt w:val="bullet"/>
+      <w:lvlText w:val=""/>
+      <w:lvlJc w:val="left"/>
+      <w:pPr>
+        <w:tabs>
+          <w:tab w:val="num" w:pos="2880"/>
+        </w:tabs>
+        <w:ind w:left="2880" w:hanging="360"/>
+      </w:pPr>
+      <w:rPr>
+        <w:rFonts w:ascii="Symbol" w:hAnsi="Symbol" w:hint="default"/>
+        <w:sz w:val="20"/>
+      </w:rPr>
+    </w:lvl>
+    <w:lvl w:ilvl="4" w:tentative="1">
+      <w:start w:val="1"/>
+      <w:numFmt w:val="bullet"/>
+      <w:lvlText w:val=""/>
+      <w:lvlJc w:val="left"/>
+      <w:pPr>
+        <w:tabs>
+          <w:tab w:val="num" w:pos="3600"/>
+        </w:tabs>
+        <w:ind w:left="3600" w:hanging="360"/>
+      </w:pPr>
+      <w:rPr>
+        <w:rFonts w:ascii="Symbol" w:hAnsi="Symbol" w:hint="default"/>
+        <w:sz w:val="20"/>
+      </w:rPr>
+    </w:lvl>
+    <w:lvl w:ilvl="5" w:tentative="1">
+      <w:start w:val="1"/>
+      <w:numFmt w:val="bullet"/>
+      <w:lvlText w:val=""/>
+      <w:lvlJc w:val="left"/>
+      <w:pPr>
+        <w:tabs>
+          <w:tab w:val="num" w:pos="4320"/>
+        </w:tabs>
+        <w:ind w:left="4320" w:hanging="360"/>
+      </w:pPr>
+      <w:rPr>
+        <w:rFonts w:ascii="Symbol" w:hAnsi="Symbol" w:hint="default"/>
+        <w:sz w:val="20"/>
+      </w:rPr>
+    </w:lvl>
+    <w:lvl w:ilvl="6" w:tentative="1">
+      <w:start w:val="1"/>
+      <w:numFmt w:val="bullet"/>
+      <w:lvlText w:val=""/>
+      <w:lvlJc w:val="left"/>
+      <w:pPr>
+        <w:tabs>
+          <w:tab w:val="num" w:pos="5040"/>
+        </w:tabs>
+        <w:ind w:left="5040" w:hanging="360"/>
+      </w:pPr>
+      <w:rPr>
+        <w:rFonts w:ascii="Symbol" w:hAnsi="Symbol" w:hint="default"/>
+        <w:sz w:val="20"/>
+      </w:rPr>
+    </w:lvl>
+    <w:lvl w:ilvl="7" w:tentative="1">
+      <w:start w:val="1"/>
+      <w:numFmt w:val="bullet"/>
+      <w:lvlText w:val=""/>
+      <w:lvlJc w:val="left"/>
+      <w:pPr>
+        <w:tabs>
+          <w:tab w:val="num" w:pos="5760"/>
+        </w:tabs>
+        <w:ind w:left="5760" w:hanging="360"/>
+      </w:pPr>
+      <w:rPr>
+        <w:rFonts w:ascii="Symbol" w:hAnsi="Symbol" w:hint="default"/>
+        <w:sz w:val="20"/>
+      </w:rPr>
+    </w:lvl>
+    <w:lvl w:ilvl="8" w:tentative="1">
+      <w:start w:val="1"/>
+      <w:numFmt w:val="bullet"/>
+      <w:lvlText w:val=""/>
+      <w:lvlJc w:val="left"/>
+      <w:pPr>
+        <w:tabs>
+          <w:tab w:val="num" w:pos="6480"/>
+        </w:tabs>
+        <w:ind w:left="6480" w:hanging="360"/>
+      </w:pPr>
+      <w:rPr>
+        <w:rFonts w:ascii="Symbol" w:hAnsi="Symbol" w:hint="default"/>
+        <w:sz w:val="20"/>
+      </w:rPr>
+    </w:lvl>
+  </w:abstractNum>
+  <w:num w:numId="1" w16cid:durableId="332800418">
+    <w:abstractNumId w:val="1"/>
+  </w:num>
+  <w:num w:numId="2" w16cid:durableId="1368607090">
+    <w:abstractNumId w:val="0"/>
+  </w:num>
+</w:numbering>
 </file>
 
 <file path=word/styles.xml><?xml version="1.0" encoding="utf-8"?>
@@ -1855,6 +2565,14 @@
       <w:szCs w:val="20"/>
     </w:rPr>
   </w:style>
+  <w:style w:type="paragraph" w:customStyle="1" w:styleId="text-size-chat">
+    <w:name w:val="text-size-chat"/>
+    <w:basedOn w:val="Normal"/>
+    <w:rsid w:val="00EE4829"/>
+    <w:pPr>
+      <w:spacing w:before="100" w:beforeAutospacing="1" w:after="100" w:afterAutospacing="1"/>
+    </w:pPr>
+  </w:style>
 </w:styles>
 </file>
 

</xml_diff>

<commit_message>
Codex/jump tab finish (#9)
* Fix coach and insights ask flows

* Update coach_command_center.py

* Finalize athlete view, insights voice, forecast cleanup, and ESPN stats

* Finish jump testing tab and dashboard cleanup

* update db

* Automate weekly evidence review

* Deduplicate syndicated research items

* Updated research detail to insights page from staging to live
</commit_message>
<xml_diff>
--- a/worksheet.docx
+++ b/worksheet.docx
@@ -86,6 +86,407 @@
       </w:r>
       <w:r>
         <w:t xml:space="preserve"> That's a strong and accurate answer in an interview.</w:t>
+      </w:r>
+    </w:p>
+    <w:p>
+      <w:pPr>
+        <w:pStyle w:val="text-size-chat"/>
+        <w:numPr>
+          <w:ilvl w:val="0"/>
+          <w:numId w:val="1"/>
+        </w:numPr>
+        <w:pBdr>
+          <w:top w:val="single" w:sz="2" w:space="0" w:color="auto"/>
+          <w:left w:val="single" w:sz="2" w:space="0" w:color="auto"/>
+          <w:bottom w:val="single" w:sz="2" w:space="0" w:color="auto"/>
+          <w:right w:val="single" w:sz="2" w:space="0" w:color="auto"/>
+        </w:pBdr>
+        <w:shd w:val="clear" w:color="auto" w:fill="FFFFFF"/>
+        <w:spacing w:before="0" w:beforeAutospacing="0" w:after="90" w:afterAutospacing="0"/>
+        <w:rPr>
+          <w:rFonts w:ascii="Segoe UI" w:hAnsi="Segoe UI" w:cs="Segoe UI"/>
+          <w:color w:val="0D0D0D"/>
+          <w:sz w:val="20"/>
+          <w:szCs w:val="20"/>
+        </w:rPr>
+      </w:pPr>
+      <w:r>
+        <w:t>------------------------------------------------------------------------</w:t>
+      </w:r>
+      <w:r>
+        <w:br/>
+      </w:r>
+      <w:r>
+        <w:rPr>
+          <w:rFonts w:ascii="Segoe UI" w:hAnsi="Segoe UI" w:cs="Segoe UI"/>
+          <w:color w:val="0D0D0D"/>
+          <w:sz w:val="20"/>
+          <w:szCs w:val="20"/>
+        </w:rPr>
+        <w:t>use the simplest tool that solves the problem well</w:t>
+      </w:r>
+    </w:p>
+    <w:p>
+      <w:pPr>
+        <w:pStyle w:val="text-size-chat"/>
+        <w:numPr>
+          <w:ilvl w:val="0"/>
+          <w:numId w:val="1"/>
+        </w:numPr>
+        <w:pBdr>
+          <w:top w:val="single" w:sz="2" w:space="0" w:color="auto"/>
+          <w:left w:val="single" w:sz="2" w:space="0" w:color="auto"/>
+          <w:bottom w:val="single" w:sz="2" w:space="0" w:color="auto"/>
+          <w:right w:val="single" w:sz="2" w:space="0" w:color="auto"/>
+        </w:pBdr>
+        <w:shd w:val="clear" w:color="auto" w:fill="FFFFFF"/>
+        <w:spacing w:before="0" w:beforeAutospacing="0" w:after="90" w:afterAutospacing="0"/>
+        <w:rPr>
+          <w:rFonts w:ascii="Segoe UI" w:hAnsi="Segoe UI" w:cs="Segoe UI"/>
+          <w:color w:val="0D0D0D"/>
+          <w:sz w:val="20"/>
+          <w:szCs w:val="20"/>
+        </w:rPr>
+      </w:pPr>
+      <w:r>
+        <w:rPr>
+          <w:rFonts w:ascii="Segoe UI" w:hAnsi="Segoe UI" w:cs="Segoe UI"/>
+          <w:color w:val="0D0D0D"/>
+          <w:sz w:val="20"/>
+          <w:szCs w:val="20"/>
+        </w:rPr>
+        <w:t>some problems need rules, dashboards, or SQL, not AI</w:t>
+      </w:r>
+    </w:p>
+    <w:p>
+      <w:pPr>
+        <w:pStyle w:val="text-size-chat"/>
+        <w:numPr>
+          <w:ilvl w:val="0"/>
+          <w:numId w:val="1"/>
+        </w:numPr>
+        <w:pBdr>
+          <w:top w:val="single" w:sz="2" w:space="0" w:color="auto"/>
+          <w:left w:val="single" w:sz="2" w:space="0" w:color="auto"/>
+          <w:bottom w:val="single" w:sz="2" w:space="0" w:color="auto"/>
+          <w:right w:val="single" w:sz="2" w:space="0" w:color="auto"/>
+        </w:pBdr>
+        <w:shd w:val="clear" w:color="auto" w:fill="FFFFFF"/>
+        <w:spacing w:before="0" w:beforeAutospacing="0" w:after="90" w:afterAutospacing="0"/>
+        <w:rPr>
+          <w:rFonts w:ascii="Segoe UI" w:hAnsi="Segoe UI" w:cs="Segoe UI"/>
+          <w:color w:val="0D0D0D"/>
+          <w:sz w:val="20"/>
+          <w:szCs w:val="20"/>
+        </w:rPr>
+      </w:pPr>
+      <w:r>
+        <w:rPr>
+          <w:rFonts w:ascii="Segoe UI" w:hAnsi="Segoe UI" w:cs="Segoe UI"/>
+          <w:color w:val="0D0D0D"/>
+          <w:sz w:val="20"/>
+          <w:szCs w:val="20"/>
+        </w:rPr>
+        <w:t>some need ML</w:t>
+      </w:r>
+    </w:p>
+    <w:p>
+      <w:pPr>
+        <w:pStyle w:val="text-size-chat"/>
+        <w:numPr>
+          <w:ilvl w:val="0"/>
+          <w:numId w:val="1"/>
+        </w:numPr>
+        <w:pBdr>
+          <w:top w:val="single" w:sz="2" w:space="0" w:color="auto"/>
+          <w:left w:val="single" w:sz="2" w:space="0" w:color="auto"/>
+          <w:bottom w:val="single" w:sz="2" w:space="0" w:color="auto"/>
+          <w:right w:val="single" w:sz="2" w:space="0" w:color="auto"/>
+        </w:pBdr>
+        <w:shd w:val="clear" w:color="auto" w:fill="FFFFFF"/>
+        <w:spacing w:before="0" w:beforeAutospacing="0" w:after="90" w:afterAutospacing="0"/>
+        <w:rPr>
+          <w:rFonts w:ascii="Segoe UI" w:hAnsi="Segoe UI" w:cs="Segoe UI"/>
+          <w:color w:val="0D0D0D"/>
+          <w:sz w:val="20"/>
+          <w:szCs w:val="20"/>
+        </w:rPr>
+      </w:pPr>
+      <w:r>
+        <w:rPr>
+          <w:rFonts w:ascii="Segoe UI" w:hAnsi="Segoe UI" w:cs="Segoe UI"/>
+          <w:color w:val="0D0D0D"/>
+          <w:sz w:val="20"/>
+          <w:szCs w:val="20"/>
+        </w:rPr>
+        <w:t>some need GenAI</w:t>
+      </w:r>
+    </w:p>
+    <w:p>
+      <w:pPr>
+        <w:pStyle w:val="text-size-chat"/>
+        <w:numPr>
+          <w:ilvl w:val="0"/>
+          <w:numId w:val="1"/>
+        </w:numPr>
+        <w:pBdr>
+          <w:top w:val="single" w:sz="2" w:space="0" w:color="auto"/>
+          <w:left w:val="single" w:sz="2" w:space="0" w:color="auto"/>
+          <w:bottom w:val="single" w:sz="2" w:space="0" w:color="auto"/>
+          <w:right w:val="single" w:sz="2" w:space="0" w:color="auto"/>
+        </w:pBdr>
+        <w:shd w:val="clear" w:color="auto" w:fill="FFFFFF"/>
+        <w:spacing w:before="0" w:beforeAutospacing="0" w:after="90" w:afterAutospacing="0"/>
+        <w:rPr>
+          <w:rFonts w:ascii="Segoe UI" w:hAnsi="Segoe UI" w:cs="Segoe UI"/>
+          <w:color w:val="0D0D0D"/>
+          <w:sz w:val="20"/>
+          <w:szCs w:val="20"/>
+        </w:rPr>
+      </w:pPr>
+      <w:r>
+        <w:rPr>
+          <w:rFonts w:ascii="Segoe UI" w:hAnsi="Segoe UI" w:cs="Segoe UI"/>
+          <w:color w:val="0D0D0D"/>
+          <w:sz w:val="20"/>
+          <w:szCs w:val="20"/>
+        </w:rPr>
+        <w:t>very few need fully autonomous agents</w:t>
+      </w:r>
+    </w:p>
+    <w:p>
+      <w:pPr>
+        <w:pStyle w:val="text-size-chat"/>
+        <w:pBdr>
+          <w:top w:val="single" w:sz="2" w:space="0" w:color="auto"/>
+          <w:left w:val="single" w:sz="2" w:space="0" w:color="auto"/>
+          <w:bottom w:val="single" w:sz="2" w:space="0" w:color="auto"/>
+          <w:right w:val="single" w:sz="2" w:space="0" w:color="auto"/>
+        </w:pBdr>
+        <w:shd w:val="clear" w:color="auto" w:fill="FFFFFF"/>
+        <w:spacing w:before="0" w:beforeAutospacing="0" w:after="0" w:afterAutospacing="0"/>
+        <w:rPr>
+          <w:rFonts w:ascii="Segoe UI" w:hAnsi="Segoe UI" w:cs="Segoe UI"/>
+          <w:color w:val="0D0D0D"/>
+          <w:sz w:val="20"/>
+          <w:szCs w:val="20"/>
+        </w:rPr>
+      </w:pPr>
+      <w:r>
+        <w:rPr>
+          <w:rFonts w:ascii="Segoe UI" w:hAnsi="Segoe UI" w:cs="Segoe UI"/>
+          <w:color w:val="0D0D0D"/>
+          <w:sz w:val="20"/>
+          <w:szCs w:val="20"/>
+        </w:rPr>
+        <w:t xml:space="preserve">For your world, WAIMS is </w:t>
+      </w:r>
+      <w:proofErr w:type="gramStart"/>
+      <w:r>
+        <w:rPr>
+          <w:rFonts w:ascii="Segoe UI" w:hAnsi="Segoe UI" w:cs="Segoe UI"/>
+          <w:color w:val="0D0D0D"/>
+          <w:sz w:val="20"/>
+          <w:szCs w:val="20"/>
+        </w:rPr>
+        <w:t>actually a</w:t>
+      </w:r>
+      <w:proofErr w:type="gramEnd"/>
+      <w:r>
+        <w:rPr>
+          <w:rFonts w:ascii="Segoe UI" w:hAnsi="Segoe UI" w:cs="Segoe UI"/>
+          <w:color w:val="0D0D0D"/>
+          <w:sz w:val="20"/>
+          <w:szCs w:val="20"/>
+        </w:rPr>
+        <w:t xml:space="preserve"> good example:</w:t>
+      </w:r>
+    </w:p>
+    <w:p>
+      <w:pPr>
+        <w:pStyle w:val="text-size-chat"/>
+        <w:numPr>
+          <w:ilvl w:val="0"/>
+          <w:numId w:val="2"/>
+        </w:numPr>
+        <w:pBdr>
+          <w:top w:val="single" w:sz="2" w:space="0" w:color="auto"/>
+          <w:left w:val="single" w:sz="2" w:space="0" w:color="auto"/>
+          <w:bottom w:val="single" w:sz="2" w:space="0" w:color="auto"/>
+          <w:right w:val="single" w:sz="2" w:space="0" w:color="auto"/>
+        </w:pBdr>
+        <w:shd w:val="clear" w:color="auto" w:fill="FFFFFF"/>
+        <w:spacing w:before="0" w:beforeAutospacing="0" w:after="90" w:afterAutospacing="0"/>
+        <w:rPr>
+          <w:rFonts w:ascii="Segoe UI" w:hAnsi="Segoe UI" w:cs="Segoe UI"/>
+          <w:color w:val="0D0D0D"/>
+          <w:sz w:val="20"/>
+          <w:szCs w:val="20"/>
+        </w:rPr>
+      </w:pPr>
+      <w:r>
+        <w:rPr>
+          <w:rFonts w:ascii="Segoe UI" w:hAnsi="Segoe UI" w:cs="Segoe UI"/>
+          <w:color w:val="0D0D0D"/>
+          <w:sz w:val="20"/>
+          <w:szCs w:val="20"/>
+        </w:rPr>
+        <w:t>readiness scoring / forecasting: ML or rule-based models</w:t>
+      </w:r>
+    </w:p>
+    <w:p>
+      <w:pPr>
+        <w:pStyle w:val="text-size-chat"/>
+        <w:numPr>
+          <w:ilvl w:val="0"/>
+          <w:numId w:val="2"/>
+        </w:numPr>
+        <w:pBdr>
+          <w:top w:val="single" w:sz="2" w:space="0" w:color="auto"/>
+          <w:left w:val="single" w:sz="2" w:space="0" w:color="auto"/>
+          <w:bottom w:val="single" w:sz="2" w:space="0" w:color="auto"/>
+          <w:right w:val="single" w:sz="2" w:space="0" w:color="auto"/>
+        </w:pBdr>
+        <w:shd w:val="clear" w:color="auto" w:fill="FFFFFF"/>
+        <w:spacing w:before="0" w:beforeAutospacing="0" w:after="90" w:afterAutospacing="0"/>
+        <w:rPr>
+          <w:rFonts w:ascii="Segoe UI" w:hAnsi="Segoe UI" w:cs="Segoe UI"/>
+          <w:color w:val="0D0D0D"/>
+          <w:sz w:val="20"/>
+          <w:szCs w:val="20"/>
+        </w:rPr>
+      </w:pPr>
+      <w:r>
+        <w:rPr>
+          <w:rFonts w:ascii="Segoe UI" w:hAnsi="Segoe UI" w:cs="Segoe UI"/>
+          <w:color w:val="0D0D0D"/>
+          <w:sz w:val="20"/>
+          <w:szCs w:val="20"/>
+        </w:rPr>
+        <w:t>force plate / pattern detection: analytics + maybe ML</w:t>
+      </w:r>
+    </w:p>
+    <w:p>
+      <w:pPr>
+        <w:pStyle w:val="text-size-chat"/>
+        <w:numPr>
+          <w:ilvl w:val="0"/>
+          <w:numId w:val="2"/>
+        </w:numPr>
+        <w:pBdr>
+          <w:top w:val="single" w:sz="2" w:space="0" w:color="auto"/>
+          <w:left w:val="single" w:sz="2" w:space="0" w:color="auto"/>
+          <w:bottom w:val="single" w:sz="2" w:space="0" w:color="auto"/>
+          <w:right w:val="single" w:sz="2" w:space="0" w:color="auto"/>
+        </w:pBdr>
+        <w:shd w:val="clear" w:color="auto" w:fill="FFFFFF"/>
+        <w:spacing w:before="0" w:beforeAutospacing="0" w:after="90" w:afterAutospacing="0"/>
+        <w:rPr>
+          <w:rFonts w:ascii="Segoe UI" w:hAnsi="Segoe UI" w:cs="Segoe UI"/>
+          <w:color w:val="0D0D0D"/>
+          <w:sz w:val="20"/>
+          <w:szCs w:val="20"/>
+        </w:rPr>
+      </w:pPr>
+      <w:proofErr w:type="gramStart"/>
+      <w:r>
+        <w:rPr>
+          <w:rFonts w:ascii="Segoe UI" w:hAnsi="Segoe UI" w:cs="Segoe UI"/>
+          <w:color w:val="0D0D0D"/>
+          <w:sz w:val="20"/>
+          <w:szCs w:val="20"/>
+        </w:rPr>
+        <w:t>coach</w:t>
+      </w:r>
+      <w:proofErr w:type="gramEnd"/>
+      <w:r>
+        <w:rPr>
+          <w:rFonts w:ascii="Segoe UI" w:hAnsi="Segoe UI" w:cs="Segoe UI"/>
+          <w:color w:val="0D0D0D"/>
+          <w:sz w:val="20"/>
+          <w:szCs w:val="20"/>
+        </w:rPr>
+        <w:t xml:space="preserve"> and athlete voice Q&amp;A: GenAI or lighter NLP on top</w:t>
+      </w:r>
+    </w:p>
+    <w:p>
+      <w:pPr>
+        <w:pStyle w:val="text-size-chat"/>
+        <w:numPr>
+          <w:ilvl w:val="0"/>
+          <w:numId w:val="2"/>
+        </w:numPr>
+        <w:pBdr>
+          <w:top w:val="single" w:sz="2" w:space="0" w:color="auto"/>
+          <w:left w:val="single" w:sz="2" w:space="0" w:color="auto"/>
+          <w:bottom w:val="single" w:sz="2" w:space="0" w:color="auto"/>
+          <w:right w:val="single" w:sz="2" w:space="0" w:color="auto"/>
+        </w:pBdr>
+        <w:shd w:val="clear" w:color="auto" w:fill="FFFFFF"/>
+        <w:spacing w:before="0" w:beforeAutospacing="0" w:after="90" w:afterAutospacing="0"/>
+        <w:rPr>
+          <w:rFonts w:ascii="Segoe UI" w:hAnsi="Segoe UI" w:cs="Segoe UI"/>
+          <w:color w:val="0D0D0D"/>
+          <w:sz w:val="20"/>
+          <w:szCs w:val="20"/>
+        </w:rPr>
+      </w:pPr>
+      <w:r>
+        <w:rPr>
+          <w:rFonts w:ascii="Segoe UI" w:hAnsi="Segoe UI" w:cs="Segoe UI"/>
+          <w:color w:val="0D0D0D"/>
+          <w:sz w:val="20"/>
+          <w:szCs w:val="20"/>
+        </w:rPr>
+        <w:t>workflow automation across reports, alerts, exports: agents later</w:t>
+      </w:r>
+    </w:p>
+    <w:p>
+      <w:pPr>
+        <w:pStyle w:val="text-size-chat"/>
+        <w:pBdr>
+          <w:top w:val="single" w:sz="2" w:space="0" w:color="auto"/>
+          <w:left w:val="single" w:sz="2" w:space="0" w:color="auto"/>
+          <w:bottom w:val="single" w:sz="2" w:space="0" w:color="auto"/>
+          <w:right w:val="single" w:sz="2" w:space="0" w:color="auto"/>
+        </w:pBdr>
+        <w:shd w:val="clear" w:color="auto" w:fill="FFFFFF"/>
+        <w:spacing w:before="0" w:beforeAutospacing="0" w:after="0" w:afterAutospacing="0"/>
+        <w:rPr>
+          <w:rFonts w:ascii="Segoe UI" w:hAnsi="Segoe UI" w:cs="Segoe UI"/>
+          <w:color w:val="0D0D0D"/>
+          <w:sz w:val="20"/>
+          <w:szCs w:val="20"/>
+        </w:rPr>
+      </w:pPr>
+      <w:proofErr w:type="gramStart"/>
+      <w:r>
+        <w:rPr>
+          <w:rFonts w:ascii="Segoe UI" w:hAnsi="Segoe UI" w:cs="Segoe UI"/>
+          <w:color w:val="0D0D0D"/>
+          <w:sz w:val="20"/>
+          <w:szCs w:val="20"/>
+        </w:rPr>
+        <w:t>So</w:t>
+      </w:r>
+      <w:proofErr w:type="gramEnd"/>
+      <w:r>
+        <w:rPr>
+          <w:rFonts w:ascii="Segoe UI" w:hAnsi="Segoe UI" w:cs="Segoe UI"/>
+          <w:color w:val="0D0D0D"/>
+          <w:sz w:val="20"/>
+          <w:szCs w:val="20"/>
+        </w:rPr>
+        <w:t xml:space="preserve"> I’d say the post is directionally smart, but it risks overselling a rigid maturity ladder. </w:t>
+      </w:r>
+      <w:r>
+        <w:rPr>
+          <w:rFonts w:ascii="Segoe UI" w:hAnsi="Segoe UI" w:cs="Segoe UI"/>
+          <w:color w:val="EE0000"/>
+          <w:sz w:val="36"/>
+          <w:szCs w:val="36"/>
+        </w:rPr>
+        <w:t>The real answer is not “what layer are you on?” so much as “what decision are you trying to improve, and what is the lightest reliable method to do it?”</w:t>
       </w:r>
     </w:p>
     <w:p>
@@ -875,6 +1276,315 @@
     </w:sectPr>
   </w:body>
 </w:document>
+</file>
+
+<file path=word/numbering.xml><?xml version="1.0" encoding="utf-8"?>
+<w:numbering xmlns:wpc="http://schemas.microsoft.com/office/word/2010/wordprocessingCanvas" xmlns:cx="http://schemas.microsoft.com/office/drawing/2014/chartex" xmlns:cx1="http://schemas.microsoft.com/office/drawing/2015/9/8/chartex" xmlns:cx2="http://schemas.microsoft.com/office/drawing/2015/10/21/chartex" xmlns:cx3="http://schemas.microsoft.com/office/drawing/2016/5/9/chartex" xmlns:cx4="http://schemas.microsoft.com/office/drawing/2016/5/10/chartex" xmlns:cx5="http://schemas.microsoft.com/office/drawing/2016/5/11/chartex" xmlns:cx6="http://schemas.microsoft.com/office/drawing/2016/5/12/chartex" xmlns:cx7="http://schemas.microsoft.com/office/drawing/2016/5/13/chartex" xmlns:cx8="http://schemas.microsoft.com/office/drawing/2016/5/14/chartex" xmlns:mc="http://schemas.openxmlformats.org/markup-compatibility/2006" xmlns:aink="http://schemas.microsoft.com/office/drawing/2016/ink" xmlns:am3d="http://schemas.microsoft.com/office/drawing/2017/model3d" xmlns:o="urn:schemas-microsoft-com:office:office" xmlns:oel="http://schemas.microsoft.com/office/2019/extlst" xmlns:r="http://schemas.openxmlformats.org/officeDocument/2006/relationships" xmlns:m="http://schemas.openxmlformats.org/officeDocument/2006/math" xmlns:v="urn:schemas-microsoft-com:vml" xmlns:wp14="http://schemas.microsoft.com/office/word/2010/wordprocessingDrawing" xmlns:wp="http://schemas.openxmlformats.org/drawingml/2006/wordprocessingDrawing" xmlns:w10="urn:schemas-microsoft-com:office:word" xmlns:w="http://schemas.openxmlformats.org/wordprocessingml/2006/main" xmlns:w14="http://schemas.microsoft.com/office/word/2010/wordml" xmlns:w15="http://schemas.microsoft.com/office/word/2012/wordml" xmlns:w16cex="http://schemas.microsoft.com/office/word/2018/wordml/cex" xmlns:w16cid="http://schemas.microsoft.com/office/word/2016/wordml/cid" xmlns:w16="http://schemas.microsoft.com/office/word/2018/wordml" xmlns:w16du="http://schemas.microsoft.com/office/word/2023/wordml/word16du" xmlns:w16sdtdh="http://schemas.microsoft.com/office/word/2020/wordml/sdtdatahash" xmlns:w16sdtfl="http://schemas.microsoft.com/office/word/2024/wordml/sdtformatlock" xmlns:w16se="http://schemas.microsoft.com/office/word/2015/wordml/symex" xmlns:wpg="http://schemas.microsoft.com/office/word/2010/wordprocessingGroup" xmlns:wpi="http://schemas.microsoft.com/office/word/2010/wordprocessingInk" xmlns:wne="http://schemas.microsoft.com/office/word/2006/wordml" xmlns:wps="http://schemas.microsoft.com/office/word/2010/wordprocessingShape" mc:Ignorable="w14 w15 w16se w16cid w16 w16cex w16sdtdh w16sdtfl w16du wp14">
+  <w:abstractNum w:abstractNumId="0" w15:restartNumberingAfterBreak="0">
+    <w:nsid w:val="02B17A15"/>
+    <w:multiLevelType w:val="multilevel"/>
+    <w:tmpl w:val="8806BCE8"/>
+    <w:lvl w:ilvl="0">
+      <w:start w:val="1"/>
+      <w:numFmt w:val="bullet"/>
+      <w:lvlText w:val=""/>
+      <w:lvlJc w:val="left"/>
+      <w:pPr>
+        <w:tabs>
+          <w:tab w:val="num" w:pos="720"/>
+        </w:tabs>
+        <w:ind w:left="720" w:hanging="360"/>
+      </w:pPr>
+      <w:rPr>
+        <w:rFonts w:ascii="Symbol" w:hAnsi="Symbol" w:hint="default"/>
+        <w:sz w:val="20"/>
+      </w:rPr>
+    </w:lvl>
+    <w:lvl w:ilvl="1" w:tentative="1">
+      <w:start w:val="1"/>
+      <w:numFmt w:val="bullet"/>
+      <w:lvlText w:val=""/>
+      <w:lvlJc w:val="left"/>
+      <w:pPr>
+        <w:tabs>
+          <w:tab w:val="num" w:pos="1440"/>
+        </w:tabs>
+        <w:ind w:left="1440" w:hanging="360"/>
+      </w:pPr>
+      <w:rPr>
+        <w:rFonts w:ascii="Symbol" w:hAnsi="Symbol" w:hint="default"/>
+        <w:sz w:val="20"/>
+      </w:rPr>
+    </w:lvl>
+    <w:lvl w:ilvl="2" w:tentative="1">
+      <w:start w:val="1"/>
+      <w:numFmt w:val="bullet"/>
+      <w:lvlText w:val=""/>
+      <w:lvlJc w:val="left"/>
+      <w:pPr>
+        <w:tabs>
+          <w:tab w:val="num" w:pos="2160"/>
+        </w:tabs>
+        <w:ind w:left="2160" w:hanging="360"/>
+      </w:pPr>
+      <w:rPr>
+        <w:rFonts w:ascii="Symbol" w:hAnsi="Symbol" w:hint="default"/>
+        <w:sz w:val="20"/>
+      </w:rPr>
+    </w:lvl>
+    <w:lvl w:ilvl="3" w:tentative="1">
+      <w:start w:val="1"/>
+      <w:numFmt w:val="bullet"/>
+      <w:lvlText w:val=""/>
+      <w:lvlJc w:val="left"/>
+      <w:pPr>
+        <w:tabs>
+          <w:tab w:val="num" w:pos="2880"/>
+        </w:tabs>
+        <w:ind w:left="2880" w:hanging="360"/>
+      </w:pPr>
+      <w:rPr>
+        <w:rFonts w:ascii="Symbol" w:hAnsi="Symbol" w:hint="default"/>
+        <w:sz w:val="20"/>
+      </w:rPr>
+    </w:lvl>
+    <w:lvl w:ilvl="4" w:tentative="1">
+      <w:start w:val="1"/>
+      <w:numFmt w:val="bullet"/>
+      <w:lvlText w:val=""/>
+      <w:lvlJc w:val="left"/>
+      <w:pPr>
+        <w:tabs>
+          <w:tab w:val="num" w:pos="3600"/>
+        </w:tabs>
+        <w:ind w:left="3600" w:hanging="360"/>
+      </w:pPr>
+      <w:rPr>
+        <w:rFonts w:ascii="Symbol" w:hAnsi="Symbol" w:hint="default"/>
+        <w:sz w:val="20"/>
+      </w:rPr>
+    </w:lvl>
+    <w:lvl w:ilvl="5" w:tentative="1">
+      <w:start w:val="1"/>
+      <w:numFmt w:val="bullet"/>
+      <w:lvlText w:val=""/>
+      <w:lvlJc w:val="left"/>
+      <w:pPr>
+        <w:tabs>
+          <w:tab w:val="num" w:pos="4320"/>
+        </w:tabs>
+        <w:ind w:left="4320" w:hanging="360"/>
+      </w:pPr>
+      <w:rPr>
+        <w:rFonts w:ascii="Symbol" w:hAnsi="Symbol" w:hint="default"/>
+        <w:sz w:val="20"/>
+      </w:rPr>
+    </w:lvl>
+    <w:lvl w:ilvl="6" w:tentative="1">
+      <w:start w:val="1"/>
+      <w:numFmt w:val="bullet"/>
+      <w:lvlText w:val=""/>
+      <w:lvlJc w:val="left"/>
+      <w:pPr>
+        <w:tabs>
+          <w:tab w:val="num" w:pos="5040"/>
+        </w:tabs>
+        <w:ind w:left="5040" w:hanging="360"/>
+      </w:pPr>
+      <w:rPr>
+        <w:rFonts w:ascii="Symbol" w:hAnsi="Symbol" w:hint="default"/>
+        <w:sz w:val="20"/>
+      </w:rPr>
+    </w:lvl>
+    <w:lvl w:ilvl="7" w:tentative="1">
+      <w:start w:val="1"/>
+      <w:numFmt w:val="bullet"/>
+      <w:lvlText w:val=""/>
+      <w:lvlJc w:val="left"/>
+      <w:pPr>
+        <w:tabs>
+          <w:tab w:val="num" w:pos="5760"/>
+        </w:tabs>
+        <w:ind w:left="5760" w:hanging="360"/>
+      </w:pPr>
+      <w:rPr>
+        <w:rFonts w:ascii="Symbol" w:hAnsi="Symbol" w:hint="default"/>
+        <w:sz w:val="20"/>
+      </w:rPr>
+    </w:lvl>
+    <w:lvl w:ilvl="8" w:tentative="1">
+      <w:start w:val="1"/>
+      <w:numFmt w:val="bullet"/>
+      <w:lvlText w:val=""/>
+      <w:lvlJc w:val="left"/>
+      <w:pPr>
+        <w:tabs>
+          <w:tab w:val="num" w:pos="6480"/>
+        </w:tabs>
+        <w:ind w:left="6480" w:hanging="360"/>
+      </w:pPr>
+      <w:rPr>
+        <w:rFonts w:ascii="Symbol" w:hAnsi="Symbol" w:hint="default"/>
+        <w:sz w:val="20"/>
+      </w:rPr>
+    </w:lvl>
+  </w:abstractNum>
+  <w:abstractNum w:abstractNumId="1" w15:restartNumberingAfterBreak="0">
+    <w:nsid w:val="6C1001F2"/>
+    <w:multiLevelType w:val="multilevel"/>
+    <w:tmpl w:val="A4387C4E"/>
+    <w:lvl w:ilvl="0">
+      <w:start w:val="1"/>
+      <w:numFmt w:val="bullet"/>
+      <w:lvlText w:val=""/>
+      <w:lvlJc w:val="left"/>
+      <w:pPr>
+        <w:tabs>
+          <w:tab w:val="num" w:pos="720"/>
+        </w:tabs>
+        <w:ind w:left="720" w:hanging="360"/>
+      </w:pPr>
+      <w:rPr>
+        <w:rFonts w:ascii="Symbol" w:hAnsi="Symbol" w:hint="default"/>
+        <w:sz w:val="20"/>
+      </w:rPr>
+    </w:lvl>
+    <w:lvl w:ilvl="1" w:tentative="1">
+      <w:start w:val="1"/>
+      <w:numFmt w:val="bullet"/>
+      <w:lvlText w:val=""/>
+      <w:lvlJc w:val="left"/>
+      <w:pPr>
+        <w:tabs>
+          <w:tab w:val="num" w:pos="1440"/>
+        </w:tabs>
+        <w:ind w:left="1440" w:hanging="360"/>
+      </w:pPr>
+      <w:rPr>
+        <w:rFonts w:ascii="Symbol" w:hAnsi="Symbol" w:hint="default"/>
+        <w:sz w:val="20"/>
+      </w:rPr>
+    </w:lvl>
+    <w:lvl w:ilvl="2" w:tentative="1">
+      <w:start w:val="1"/>
+      <w:numFmt w:val="bullet"/>
+      <w:lvlText w:val=""/>
+      <w:lvlJc w:val="left"/>
+      <w:pPr>
+        <w:tabs>
+          <w:tab w:val="num" w:pos="2160"/>
+        </w:tabs>
+        <w:ind w:left="2160" w:hanging="360"/>
+      </w:pPr>
+      <w:rPr>
+        <w:rFonts w:ascii="Symbol" w:hAnsi="Symbol" w:hint="default"/>
+        <w:sz w:val="20"/>
+      </w:rPr>
+    </w:lvl>
+    <w:lvl w:ilvl="3" w:tentative="1">
+      <w:start w:val="1"/>
+      <w:numFmt w:val="bullet"/>
+      <w:lvlText w:val=""/>
+      <w:lvlJc w:val="left"/>
+      <w:pPr>
+        <w:tabs>
+          <w:tab w:val="num" w:pos="2880"/>
+        </w:tabs>
+        <w:ind w:left="2880" w:hanging="360"/>
+      </w:pPr>
+      <w:rPr>
+        <w:rFonts w:ascii="Symbol" w:hAnsi="Symbol" w:hint="default"/>
+        <w:sz w:val="20"/>
+      </w:rPr>
+    </w:lvl>
+    <w:lvl w:ilvl="4" w:tentative="1">
+      <w:start w:val="1"/>
+      <w:numFmt w:val="bullet"/>
+      <w:lvlText w:val=""/>
+      <w:lvlJc w:val="left"/>
+      <w:pPr>
+        <w:tabs>
+          <w:tab w:val="num" w:pos="3600"/>
+        </w:tabs>
+        <w:ind w:left="3600" w:hanging="360"/>
+      </w:pPr>
+      <w:rPr>
+        <w:rFonts w:ascii="Symbol" w:hAnsi="Symbol" w:hint="default"/>
+        <w:sz w:val="20"/>
+      </w:rPr>
+    </w:lvl>
+    <w:lvl w:ilvl="5" w:tentative="1">
+      <w:start w:val="1"/>
+      <w:numFmt w:val="bullet"/>
+      <w:lvlText w:val=""/>
+      <w:lvlJc w:val="left"/>
+      <w:pPr>
+        <w:tabs>
+          <w:tab w:val="num" w:pos="4320"/>
+        </w:tabs>
+        <w:ind w:left="4320" w:hanging="360"/>
+      </w:pPr>
+      <w:rPr>
+        <w:rFonts w:ascii="Symbol" w:hAnsi="Symbol" w:hint="default"/>
+        <w:sz w:val="20"/>
+      </w:rPr>
+    </w:lvl>
+    <w:lvl w:ilvl="6" w:tentative="1">
+      <w:start w:val="1"/>
+      <w:numFmt w:val="bullet"/>
+      <w:lvlText w:val=""/>
+      <w:lvlJc w:val="left"/>
+      <w:pPr>
+        <w:tabs>
+          <w:tab w:val="num" w:pos="5040"/>
+        </w:tabs>
+        <w:ind w:left="5040" w:hanging="360"/>
+      </w:pPr>
+      <w:rPr>
+        <w:rFonts w:ascii="Symbol" w:hAnsi="Symbol" w:hint="default"/>
+        <w:sz w:val="20"/>
+      </w:rPr>
+    </w:lvl>
+    <w:lvl w:ilvl="7" w:tentative="1">
+      <w:start w:val="1"/>
+      <w:numFmt w:val="bullet"/>
+      <w:lvlText w:val=""/>
+      <w:lvlJc w:val="left"/>
+      <w:pPr>
+        <w:tabs>
+          <w:tab w:val="num" w:pos="5760"/>
+        </w:tabs>
+        <w:ind w:left="5760" w:hanging="360"/>
+      </w:pPr>
+      <w:rPr>
+        <w:rFonts w:ascii="Symbol" w:hAnsi="Symbol" w:hint="default"/>
+        <w:sz w:val="20"/>
+      </w:rPr>
+    </w:lvl>
+    <w:lvl w:ilvl="8" w:tentative="1">
+      <w:start w:val="1"/>
+      <w:numFmt w:val="bullet"/>
+      <w:lvlText w:val=""/>
+      <w:lvlJc w:val="left"/>
+      <w:pPr>
+        <w:tabs>
+          <w:tab w:val="num" w:pos="6480"/>
+        </w:tabs>
+        <w:ind w:left="6480" w:hanging="360"/>
+      </w:pPr>
+      <w:rPr>
+        <w:rFonts w:ascii="Symbol" w:hAnsi="Symbol" w:hint="default"/>
+        <w:sz w:val="20"/>
+      </w:rPr>
+    </w:lvl>
+  </w:abstractNum>
+  <w:num w:numId="1" w16cid:durableId="332800418">
+    <w:abstractNumId w:val="1"/>
+  </w:num>
+  <w:num w:numId="2" w16cid:durableId="1368607090">
+    <w:abstractNumId w:val="0"/>
+  </w:num>
+</w:numbering>
 </file>
 
 <file path=word/styles.xml><?xml version="1.0" encoding="utf-8"?>
@@ -1855,6 +2565,14 @@
       <w:szCs w:val="20"/>
     </w:rPr>
   </w:style>
+  <w:style w:type="paragraph" w:customStyle="1" w:styleId="text-size-chat">
+    <w:name w:val="text-size-chat"/>
+    <w:basedOn w:val="Normal"/>
+    <w:rsid w:val="00EE4829"/>
+    <w:pPr>
+      <w:spacing w:before="100" w:beforeAutospacing="1" w:after="100" w:afterAutospacing="1"/>
+    </w:pPr>
+  </w:style>
 </w:styles>
 </file>
 

</xml_diff>